<commit_message>
Kimya11 bilimsel kaynakcasi eklendi; 3.3 kaynakcasina IUCN raporu eklendi
</commit_message>
<xml_diff>
--- a/Kim11-3-3-Mikroplastikler.docx
+++ b/Kim11-3-3-Mikroplastikler.docx
@@ -3371,6 +3371,22 @@
           <w:lang w:val="tr-TR"/>
         </w:rPr>
         <w:t xml:space="preserve">Mikroplastik tanımı için: NOAA (ABD Ulusal Okyanus ve Atmosfer İdaresi) ve Avrupa Kimyasallar Ajansı (ECHA) mikroplastik tanımları.</w:t>
+      </w:r>
+    </w:p>
+    <w:p>
+      <w:pPr>
+        <w:jc w:val="both"/>
+        <w:rPr>
+          <w:rFonts w:ascii="Times New Roman" w:hAnsi="Times New Roman" w:cs="Times New Roman"/>
+          <w:lang w:val="tr-TR"/>
+        </w:rPr>
+      </w:pPr>
+      <w:r>
+        <w:rPr>
+          <w:rFonts w:ascii="Times New Roman" w:hAnsi="Times New Roman" w:cs="Times New Roman"/>
+          <w:lang w:val="tr-TR"/>
+        </w:rPr>
+        <w:t xml:space="preserve">Birincil ve ikincil mikroplastik sınıflandırması için: Boucher ve Friot, Primary Microplastics in the Oceans, IUCN, 2017.</w:t>
       </w:r>
     </w:p>
     <w:sectPr>

</xml_diff>

<commit_message>
Kim11-3-3-Mikroplastikler: gorsel alanlarina Shutter onizlemeleri yerlestirildi (2.3 bicimi)
</commit_message>
<xml_diff>
--- a/Kim11-3-3-Mikroplastikler.docx
+++ b/Kim11-3-3-Mikroplastikler.docx
@@ -62,77 +62,60 @@
           <w:tcPr>
             <w:tcW w:w="4500" w:type="dxa"/>
           </w:tcPr>
-          <w:tbl>
-            <w:tblPr>
-              <w:tblW w:w="4300" w:type="dxa"/>
+          <w:p>
+            <w:pPr>
               <w:jc w:val="center"/>
-              <w:tblBorders>
-                <w:top w:val="single" w:sz="8" w:space="0" w:color="7F7F7F"/>
-                <w:left w:val="single" w:sz="8" w:space="0" w:color="7F7F7F"/>
-                <w:bottom w:val="single" w:sz="8" w:space="0" w:color="7F7F7F"/>
-                <w:right w:val="single" w:sz="8" w:space="0" w:color="7F7F7F"/>
-              </w:tblBorders>
-            </w:tblPr>
-            <w:tblGrid>
-              <w:gridCol w:w="4300"/>
-            </w:tblGrid>
-            <w:tr>
-              <w:tc>
-                <w:tcPr>
-                  <w:tcW w:w="4300" w:type="dxa"/>
-                  <w:shd w:val="clear" w:color="auto" w:fill="EDEDED"/>
-                </w:tcPr>
-                <w:p>
-                  <w:pPr>
-                    <w:jc w:val="both"/>
-                    <w:rPr>
-                      <w:rFonts w:ascii="Times New Roman" w:hAnsi="Times New Roman" w:cs="Times New Roman"/>
-                      <w:lang w:val="tr-TR"/>
-                    </w:rPr>
-                  </w:pPr>
-                  <w:r>
-                    <w:rPr>
-                      <w:rFonts w:ascii="Times New Roman" w:hAnsi="Times New Roman" w:cs="Times New Roman"/>
-                      <w:lang w:val="tr-TR"/>
-                    </w:rPr>
-                    <w:t xml:space="preserve">GÖRSEL ALANI (Shutterstock)</w:t>
-                  </w:r>
-                </w:p>
-                <w:p>
-                  <w:pPr>
-                    <w:jc w:val="both"/>
-                    <w:rPr>
-                      <w:rFonts w:ascii="Times New Roman" w:hAnsi="Times New Roman" w:cs="Times New Roman"/>
-                      <w:lang w:val="tr-TR"/>
-                    </w:rPr>
-                  </w:pPr>
-                  <w:r>
-                    <w:rPr>
-                      <w:rFonts w:ascii="Times New Roman" w:hAnsi="Times New Roman" w:cs="Times New Roman"/>
-                      <w:lang w:val="tr-TR"/>
-                    </w:rPr>
-                    <w:t xml:space="preserve">Tarif: Beyaz zemin üzerinde mavi tek kullanımlık cerrahi maske; mümkünse kumaş katmanlarının yakın çekimi.</w:t>
-                  </w:r>
-                </w:p>
-                <w:p>
-                  <w:pPr>
-                    <w:jc w:val="both"/>
-                    <w:rPr>
-                      <w:rFonts w:ascii="Times New Roman" w:hAnsi="Times New Roman" w:cs="Times New Roman"/>
-                      <w:lang w:val="tr-TR"/>
-                    </w:rPr>
-                  </w:pPr>
-                  <w:r>
-                    <w:rPr>
-                      <w:rFonts w:ascii="Times New Roman" w:hAnsi="Times New Roman" w:cs="Times New Roman"/>
-                      <w:lang w:val="tr-TR"/>
-                    </w:rPr>
-                    <w:t xml:space="preserve">Shutter ID: 2789732169 (fotoğraf) — Stacked blue disposable surgical face masks</w:t>
-                  </w:r>
-                </w:p>
-              </w:tc>
-            </w:tr>
-          </w:tbl>
+            </w:pPr>
+            <w:r>
+              <w:drawing>
+                <wp:inline xmlns:a="http://schemas.openxmlformats.org/drawingml/2006/main" xmlns:pic="http://schemas.openxmlformats.org/drawingml/2006/picture">
+                  <wp:extent cx="2664000" cy="1919856"/>
+                  <wp:docPr id="900009" name="Picture 900009"/>
+                  <wp:cNvGraphicFramePr>
+                    <a:graphicFrameLocks noChangeAspect="1"/>
+                  </wp:cNvGraphicFramePr>
+                  <a:graphic>
+                    <a:graphicData uri="http://schemas.openxmlformats.org/drawingml/2006/picture">
+                      <pic:pic>
+                        <pic:nvPicPr>
+                          <pic:cNvPr id="0" name="2789732169_d.jpg"/>
+                          <pic:cNvPicPr/>
+                        </pic:nvPicPr>
+                        <pic:blipFill>
+                          <a:blip r:embed="rId13"/>
+                          <a:stretch>
+                            <a:fillRect/>
+                          </a:stretch>
+                        </pic:blipFill>
+                        <pic:spPr>
+                          <a:xfrm>
+                            <a:off x="0" y="0"/>
+                            <a:ext cx="2664000" cy="1919856"/>
+                          </a:xfrm>
+                          <a:prstGeom prst="rect"/>
+                        </pic:spPr>
+                      </pic:pic>
+                    </a:graphicData>
+                  </a:graphic>
+                </wp:inline>
+              </w:drawing>
+            </w:r>
+          </w:p>
+          <w:p>
+            <w:pPr>
+              <w:jc w:val="center"/>
+            </w:pPr>
+            <w:r>
+              <w:rPr>
+                <w:rFonts w:ascii="Times New Roman" w:hAnsi="Times New Roman" w:cs="Times New Roman"/>
+                <w:b/>
+                <w:bCs/>
+                <w:highlight w:val="yellow"/>
+                <w:lang w:val="tr-TR"/>
+              </w:rPr>
+              <w:t xml:space="preserve">Shutter id: 2789732169</w:t>
+            </w:r>
+          </w:p>
           <w:p>
             <w:pPr>
               <w:jc w:val="center"/>

</xml_diff>

<commit_message>
3.3: mikroplastik gorseli cift gorsele cikarildi (Gorsel C plastik peletler, Shutter 2748403795; mikroplastikler Gorsel D), atiflar guncellendi
</commit_message>
<xml_diff>
--- a/Kim11-3-3-Mikroplastikler.docx
+++ b/Kim11-3-3-Mikroplastikler.docx
@@ -1544,88 +1544,198 @@
           <w:rFonts w:ascii="Times New Roman" w:hAnsi="Times New Roman" w:cs="Times New Roman"/>
           <w:lang w:val="tr-TR"/>
         </w:rPr>
-        <w:t xml:space="preserve">Kıyıdaki pet şişeden kopan parçacıklar ile bazı yüz temizleme jellerindeki küçük plastik boncuklar çevreye farklı yollardan ulaşır. Bu nedenle mikroplastikler kaynaklarına göre iki grupta incelenir. Birincil mikroplastikler, doğrudan küçük boyutta üretilen ya da ürünlerin kullanımı sırasında küçük parçacıklar hâlinde çevreye salınan plastiklerdir. Bazı kozmetik ve temizlik ürünlerindeki mikroboncuklar, plastik eşya üretmek için eritilmeye hazır bekleyen mercimek büyüklüğündeki plastik taneler (pelet), sentetik kumaşların yıkanması sırasında kopan lifler (mikrofiberler) ve araç lastiklerinin yolda aşınmasıyla oluşan parçacıklar birincil mikroplastiklere örnektir (Görsel C). İkincil mikroplastikler ise plastik şişe, poşet, ambalaj ve balık ağı gibi büyük plastik atıkların doğada parçalanmasıyla oluşur. Nanoplastikler çoğunlukla mikroplastiklerin zamanla daha da ufalanmasıyla ortaya çıkar.</w:t>
+        <w:t xml:space="preserve">Kıyıdaki pet şişeden kopan parçacıklar ile bazı yüz temizleme jellerindeki küçük plastik boncuklar çevreye farklı yollardan ulaşır. Bu nedenle mikroplastikler kaynaklarına göre iki grupta incelenir. Birincil mikroplastikler, doğrudan küçük boyutta üretilen ya da ürünlerin kullanımı sırasında küçük parçacıklar hâlinde çevreye salınan plastiklerdir. Bazı kozmetik ve temizlik ürünlerindeki mikroboncuklar, plastik eşya üretmek için eritilmeye hazır bekleyen mercimek büyüklüğündeki plastik taneler (pelet) (Görsel C), sentetik kumaşların yıkanması sırasında kopan lifler (mikrofiberler) ve araç lastiklerinin yolda aşınmasıyla oluşan parçacıklar birincil mikroplastiklere örnektir (Görsel D). İkincil mikroplastikler ise plastik şişe, poşet, ambalaj ve balık ağı gibi büyük plastik atıkların doğada parçalanmasıyla oluşur. Nanoplastikler çoğunlukla mikroplastiklerin zamanla daha da ufalanmasıyla ortaya çıkar.</w:t>
       </w:r>
     </w:p>
-    <w:p>
-      <w:pPr>
+    <w:tbl>
+      <w:tblPr>
+        <w:tblW w:w="9000" w:type="dxa"/>
         <w:jc w:val="center"/>
-      </w:pPr>
-      <w:r>
-        <w:drawing>
-          <wp:inline xmlns:a="http://schemas.openxmlformats.org/drawingml/2006/main" xmlns:pic="http://schemas.openxmlformats.org/drawingml/2006/picture">
-            <wp:extent cx="4000000" cy="2520000"/>
-            <wp:docPr id="900008" name="Picture 900008"/>
-            <wp:cNvGraphicFramePr>
-              <a:graphicFrameLocks noChangeAspect="1"/>
-            </wp:cNvGraphicFramePr>
-            <a:graphic>
-              <a:graphicData uri="http://schemas.openxmlformats.org/drawingml/2006/picture">
-                <pic:pic>
-                  <pic:nvPicPr>
-                    <pic:cNvPr id="0" name="2172891977_d.jpg"/>
-                    <pic:cNvPicPr/>
-                  </pic:nvPicPr>
-                  <pic:blipFill>
-                    <a:blip r:embed="rId12"/>
-                    <a:stretch>
-                      <a:fillRect/>
-                    </a:stretch>
-                  </pic:blipFill>
-                  <pic:spPr>
-                    <a:xfrm>
-                      <a:off x="0" y="0"/>
-                      <a:ext cx="4000000" cy="2520000"/>
-                    </a:xfrm>
-                    <a:prstGeom prst="rect"/>
-                  </pic:spPr>
-                </pic:pic>
-              </a:graphicData>
-            </a:graphic>
-          </wp:inline>
-        </w:drawing>
-      </w:r>
-    </w:p>
-    <w:p>
-      <w:pPr>
-        <w:jc w:val="center"/>
-      </w:pPr>
-      <w:r>
-        <w:rPr>
-          <w:rFonts w:ascii="Times New Roman" w:hAnsi="Times New Roman" w:cs="Times New Roman"/>
-          <w:b/>
-          <w:bCs/>
-          <w:highlight w:val="yellow"/>
-          <w:lang w:val="tr-TR"/>
-        </w:rPr>
-        <w:t xml:space="preserve">Shutter id: 2172891977</w:t>
-      </w:r>
-    </w:p>
-    <w:p>
-      <w:pPr>
-        <w:jc w:val="center"/>
-        <w:rPr>
-          <w:rFonts w:ascii="Times New Roman" w:hAnsi="Times New Roman" w:cs="Times New Roman"/>
-          <w:lang w:val="tr-TR"/>
-        </w:rPr>
-      </w:pPr>
-      <w:r>
-        <w:rPr>
-          <w:rFonts w:ascii="Times New Roman" w:hAnsi="Times New Roman" w:cs="Times New Roman"/>
-          <w:b/>
-          <w:bCs/>
-          <w:lang w:val="tr-TR"/>
-        </w:rPr>
-        <w:t xml:space="preserve">Görsel C:</w:t>
-      </w:r>
-      <w:r>
-        <w:rPr>
-          <w:rFonts w:ascii="Times New Roman" w:hAnsi="Times New Roman" w:cs="Times New Roman"/>
-          <w:lang w:val="tr-TR"/>
-        </w:rPr>
-        <w:t xml:space="preserve"> Mikroplastikler</w:t>
-      </w:r>
-    </w:p>
+        <w:tblBorders>
+          <w:top w:val="nil"/>
+          <w:left w:val="nil"/>
+          <w:bottom w:val="nil"/>
+          <w:right w:val="nil"/>
+          <w:insideH w:val="nil"/>
+          <w:insideV w:val="nil"/>
+        </w:tblBorders>
+        <w:tblLayout w:type="fixed"/>
+      </w:tblPr>
+      <w:tblGrid>
+        <w:gridCol w:w="4500"/>
+        <w:gridCol w:w="4500"/>
+      </w:tblGrid>
+      <w:tr>
+        <w:tc>
+          <w:tcPr>
+            <w:tcW w:w="4500" w:type="dxa"/>
+          </w:tcPr>
+          <w:p>
+            <w:pPr>
+              <w:jc w:val="center"/>
+            </w:pPr>
+            <w:r>
+              <w:drawing>
+                <wp:inline xmlns:a="http://schemas.openxmlformats.org/drawingml/2006/main" xmlns:pic="http://schemas.openxmlformats.org/drawingml/2006/picture">
+                  <wp:extent cx="2628000" cy="1930704"/>
+                  <wp:docPr id="900010" name="Picture 900010"/>
+                  <wp:cNvGraphicFramePr>
+                    <a:graphicFrameLocks noChangeAspect="1"/>
+                  </wp:cNvGraphicFramePr>
+                  <a:graphic>
+                    <a:graphicData uri="http://schemas.openxmlformats.org/drawingml/2006/picture">
+                      <pic:pic>
+                        <pic:nvPicPr>
+                          <pic:cNvPr id="0" name="2748403795_d.jpg"/>
+                          <pic:cNvPicPr/>
+                        </pic:nvPicPr>
+                        <pic:blipFill>
+                          <a:blip r:embed="rId14"/>
+                          <a:stretch>
+                            <a:fillRect/>
+                          </a:stretch>
+                        </pic:blipFill>
+                        <pic:spPr>
+                          <a:xfrm>
+                            <a:off x="0" y="0"/>
+                            <a:ext cx="2628000" cy="1930704"/>
+                          </a:xfrm>
+                          <a:prstGeom prst="rect"/>
+                        </pic:spPr>
+                      </pic:pic>
+                    </a:graphicData>
+                  </a:graphic>
+                </wp:inline>
+              </w:drawing>
+            </w:r>
+          </w:p>
+          <w:p>
+            <w:pPr>
+              <w:jc w:val="center"/>
+            </w:pPr>
+            <w:r>
+              <w:rPr>
+                <w:rFonts w:ascii="Times New Roman" w:hAnsi="Times New Roman" w:cs="Times New Roman"/>
+                <w:b/>
+                <w:bCs/>
+                <w:highlight w:val="yellow"/>
+                <w:lang w:val="tr-TR"/>
+              </w:rPr>
+              <w:t xml:space="preserve">Shutter id: 2748403795</w:t>
+            </w:r>
+          </w:p>
+          <w:p>
+            <w:pPr>
+              <w:jc w:val="center"/>
+              <w:rPr>
+                <w:rFonts w:ascii="Times New Roman" w:hAnsi="Times New Roman" w:cs="Times New Roman"/>
+                <w:lang w:val="tr-TR"/>
+              </w:rPr>
+            </w:pPr>
+            <w:r>
+              <w:rPr>
+                <w:rFonts w:ascii="Times New Roman" w:hAnsi="Times New Roman" w:cs="Times New Roman"/>
+                <w:b/>
+                <w:bCs/>
+                <w:lang w:val="tr-TR"/>
+              </w:rPr>
+              <w:t xml:space="preserve">Görsel C:</w:t>
+            </w:r>
+            <w:r>
+              <w:rPr>
+                <w:rFonts w:ascii="Times New Roman" w:hAnsi="Times New Roman" w:cs="Times New Roman"/>
+                <w:lang w:val="tr-TR"/>
+              </w:rPr>
+              <w:t xml:space="preserve"> Plastik üretiminde kullanılan peletler</w:t>
+            </w:r>
+          </w:p>
+        </w:tc>
+        <w:tc>
+          <w:tcPr>
+            <w:tcW w:w="4500" w:type="dxa"/>
+          </w:tcPr>
+          <w:p>
+            <w:pPr>
+              <w:jc w:val="center"/>
+            </w:pPr>
+            <w:r>
+              <w:drawing>
+                <wp:inline xmlns:a="http://schemas.openxmlformats.org/drawingml/2006/main" xmlns:pic="http://schemas.openxmlformats.org/drawingml/2006/picture">
+                  <wp:extent cx="2628000" cy="1655640"/>
+                  <wp:docPr id="900008" name="Picture 900008"/>
+                  <wp:cNvGraphicFramePr>
+                    <a:graphicFrameLocks noChangeAspect="1"/>
+                  </wp:cNvGraphicFramePr>
+                  <a:graphic>
+                    <a:graphicData uri="http://schemas.openxmlformats.org/drawingml/2006/picture">
+                      <pic:pic>
+                        <pic:nvPicPr>
+                          <pic:cNvPr id="0" name="2172891977_d.jpg"/>
+                          <pic:cNvPicPr/>
+                        </pic:nvPicPr>
+                        <pic:blipFill>
+                          <a:blip r:embed="rId12"/>
+                          <a:stretch>
+                            <a:fillRect/>
+                          </a:stretch>
+                        </pic:blipFill>
+                        <pic:spPr>
+                          <a:xfrm>
+                            <a:off x="0" y="0"/>
+                            <a:ext cx="2628000" cy="1655640"/>
+                          </a:xfrm>
+                          <a:prstGeom prst="rect"/>
+                        </pic:spPr>
+                      </pic:pic>
+                    </a:graphicData>
+                  </a:graphic>
+                </wp:inline>
+              </w:drawing>
+            </w:r>
+          </w:p>
+          <w:p>
+            <w:pPr>
+              <w:jc w:val="center"/>
+            </w:pPr>
+            <w:r>
+              <w:rPr>
+                <w:rFonts w:ascii="Times New Roman" w:hAnsi="Times New Roman" w:cs="Times New Roman"/>
+                <w:b/>
+                <w:bCs/>
+                <w:highlight w:val="yellow"/>
+                <w:lang w:val="tr-TR"/>
+              </w:rPr>
+              <w:t xml:space="preserve">Shutter id: 2172891977</w:t>
+            </w:r>
+          </w:p>
+          <w:p>
+            <w:pPr>
+              <w:jc w:val="center"/>
+              <w:rPr>
+                <w:rFonts w:ascii="Times New Roman" w:hAnsi="Times New Roman" w:cs="Times New Roman"/>
+                <w:lang w:val="tr-TR"/>
+              </w:rPr>
+            </w:pPr>
+            <w:r>
+              <w:rPr>
+                <w:rFonts w:ascii="Times New Roman" w:hAnsi="Times New Roman" w:cs="Times New Roman"/>
+                <w:b/>
+                <w:bCs/>
+                <w:lang w:val="tr-TR"/>
+              </w:rPr>
+              <w:t xml:space="preserve">Görsel D:</w:t>
+            </w:r>
+            <w:r>
+              <w:rPr>
+                <w:rFonts w:ascii="Times New Roman" w:hAnsi="Times New Roman" w:cs="Times New Roman"/>
+                <w:lang w:val="tr-TR"/>
+              </w:rPr>
+              <w:t xml:space="preserve"> Mikroplastikler</w:t>
+            </w:r>
+          </w:p>
+        </w:tc>
+      </w:tr>
+    </w:tbl>
     <w:p>
       <w:pPr>
         <w:jc w:val="both"/>

</xml_diff>